<commit_message>
Fill in repository URL now that the repo is pushed to GitHub
Co-Authored-By: Claude Sonnet 5 <noreply@anthropic.com>
</commit_message>
<xml_diff>
--- a/REPORT.docx
+++ b/REPORT.docx
@@ -73,13 +73,11 @@
       </w:pPr>
       <w:r>
         <w:rPr>
-          <w:i/>
-          <w:iCs/>
           <w:color w:val="555555"/>
           <w:sz w:val="22"/>
           <w:szCs w:val="22"/>
         </w:rPr>
-        <w:t xml:space="preserve">Repository: &lt;insert your GitHub repository URL here after pushing&gt;</w:t>
+        <w:t xml:space="preserve">Repository: https://github.com/SaiSowjanyaVadapalli/heart-disease-mlops</w:t>
       </w:r>
     </w:p>
     <w:p>
@@ -2473,7 +2471,7 @@
         <w:spacing w:after="140"/>
       </w:pPr>
       <w:r>
-        <w:t xml:space="preserve">&lt;insert your GitHub repository URL here&gt;</w:t>
+        <w:t xml:space="preserve">https://github.com/SaiSowjanyaVadapalli/heart-disease-mlops</w:t>
       </w:r>
     </w:p>
     <w:sectPr>

</xml_diff>